<commit_message>
Muestra v3: versión corta de 5 minutos y amplia de 10 minutos
Co-Authored-By: Claude Opus 5.5 <noreply@anthropic.com>
Claude-Session: https://claude.ai/code/session_01P5F6YBSbmgYFHyY7RUeBgK
</commit_message>
<xml_diff>
--- a/proyecto-inclusion-financiera/manual/muestras/Muestra_version_corta_y_amplia.docx
+++ b/proyecto-inclusion-financiera/manual/muestras/Muestra_version_corta_y_amplia.docx
@@ -75,7 +75,7 @@
           <w:b/>
           <w:bCs/>
         </w:rPr>
-        <w:t xml:space="preserve">Versión corta (2 a 3 minutos):</w:t>
+        <w:t xml:space="preserve">Versión corta (5 minutos):</w:t>
       </w:r>
       <w:r>
         <w:t xml:space="preserve"> lo indispensable para actuar. Sirve para quien tiene poco tiempo o ya conoce el tema.</w:t>
@@ -94,7 +94,7 @@
           <w:b/>
           <w:bCs/>
         </w:rPr>
-        <w:t xml:space="preserve">Versión amplia (8 a 10 minutos, contando la corta):</w:t>
+        <w:t xml:space="preserve">Versión amplia (10 minutos, contando la corta):</w:t>
       </w:r>
       <w:r>
         <w:t xml:space="preserve"> explicación paso a paso, ejemplos con números, tres casos y errores frecuentes.</w:t>
@@ -173,7 +173,7 @@
         <w:t xml:space="preserve">Tiempo de lectura:</w:t>
       </w:r>
       <w:r>
-        <w:t xml:space="preserve"> versión corta 2 a 3 minutos · versión amplia 8 a 10 minutos.</w:t>
+        <w:t xml:space="preserve"> versión corta 5 minutos · versión amplia 10 minutos.</w:t>
       </w:r>
     </w:p>
     <w:p>
@@ -181,7 +181,7 @@
         <w:pStyle w:val="Heading3"/>
       </w:pPr>
       <w:r>
-        <w:t xml:space="preserve">Versión corta (2 a 3 minutos)</w:t>
+        <w:t xml:space="preserve">Versión corta (5 minutos)</w:t>
       </w:r>
     </w:p>
     <w:p>
@@ -637,6 +637,234 @@
           <w:b/>
           <w:bCs/>
         </w:rPr>
+        <w:t xml:space="preserve">Por qué importa.</w:t>
+      </w:r>
+      <w:r>
+        <w:t xml:space="preserve"> Si cuentas un préstamo o un adelanto como si fuera salario, puedes comprometerte a gastos que tu trabajo no cubre. El problema aparece semanas después, cuando el préstamo se descuenta o hay que pagarlo.</w:t>
+      </w:r>
+    </w:p>
+    <w:p>
+      <w:r>
+        <w:rPr>
+          <w:b/>
+          <w:bCs/>
+        </w:rPr>
+        <w:t xml:space="preserve">Un caso en un minuto.</w:t>
+      </w:r>
+      <w:r>
+        <w:t xml:space="preserve"> A Alex le adelantan 400 de su salario. Esa semana su cuenta muestra más dinero que nunca. Si lo gasta en un refrigerador, en las próximas semanas cobrará 400 menos y le faltará para la renta. El adelanto no era ingreso nuevo: era su propio salario futuro.</w:t>
+      </w:r>
+    </w:p>
+    <w:p>
+      <w:r>
+        <w:rPr>
+          <w:b/>
+          <w:bCs/>
+        </w:rPr>
+        <w:t xml:space="preserve">Cómo aplicarlo esta semana:</w:t>
+      </w:r>
+    </w:p>
+    <w:p>
+      <w:pPr>
+        <w:pStyle w:val="ListParagraph"/>
+        <w:numPr>
+          <w:ilvl w:val="0"/>
+          <w:numId w:val="4"/>
+        </w:numPr>
+      </w:pPr>
+      <w:r>
+        <w:t xml:space="preserve">Revisa los depósitos de tu cuenta del último mes.</w:t>
+      </w:r>
+    </w:p>
+    <w:p>
+      <w:pPr>
+        <w:pStyle w:val="ListParagraph"/>
+        <w:numPr>
+          <w:ilvl w:val="0"/>
+          <w:numId w:val="4"/>
+        </w:numPr>
+      </w:pPr>
+      <w:r>
+        <w:t xml:space="preserve">Marca cada uno con una letra: </w:t>
+      </w:r>
+      <w:r>
+        <w:rPr>
+          <w:b/>
+          <w:bCs/>
+        </w:rPr>
+        <w:t xml:space="preserve">I</w:t>
+      </w:r>
+      <w:r>
+        <w:t xml:space="preserve"> (ingreso ganado), </w:t>
+      </w:r>
+      <w:r>
+        <w:rPr>
+          <w:b/>
+          <w:bCs/>
+        </w:rPr>
+        <w:t xml:space="preserve">P</w:t>
+      </w:r>
+      <w:r>
+        <w:t xml:space="preserve"> (préstamo), </w:t>
+      </w:r>
+      <w:r>
+        <w:rPr>
+          <w:b/>
+          <w:bCs/>
+        </w:rPr>
+        <w:t xml:space="preserve">M</w:t>
+      </w:r>
+      <w:r>
+        <w:t xml:space="preserve"> (movimiento entre tus cuentas) o </w:t>
+      </w:r>
+      <w:r>
+        <w:rPr>
+          <w:b/>
+          <w:bCs/>
+        </w:rPr>
+        <w:t xml:space="preserve">D</w:t>
+      </w:r>
+      <w:r>
+        <w:t xml:space="preserve"> (devolución).</w:t>
+      </w:r>
+    </w:p>
+    <w:p>
+      <w:pPr>
+        <w:pStyle w:val="ListParagraph"/>
+        <w:numPr>
+          <w:ilvl w:val="0"/>
+          <w:numId w:val="4"/>
+        </w:numPr>
+      </w:pPr>
+      <w:r>
+        <w:t xml:space="preserve">Suma solo los que marcaste con </w:t>
+      </w:r>
+      <w:r>
+        <w:rPr>
+          <w:b/>
+          <w:bCs/>
+        </w:rPr>
+        <w:t xml:space="preserve">I</w:t>
+      </w:r>
+      <w:r>
+        <w:t xml:space="preserve">. Ese es tu ingreso real del mes.</w:t>
+      </w:r>
+    </w:p>
+    <w:p>
+      <w:pPr>
+        <w:pStyle w:val="ListParagraph"/>
+        <w:numPr>
+          <w:ilvl w:val="0"/>
+          <w:numId w:val="4"/>
+        </w:numPr>
+      </w:pPr>
+      <w:r>
+        <w:t xml:space="preserve">Para cada </w:t>
+      </w:r>
+      <w:r>
+        <w:rPr>
+          <w:b/>
+          <w:bCs/>
+        </w:rPr>
+        <w:t xml:space="preserve">P</w:t>
+      </w:r>
+      <w:r>
+        <w:t xml:space="preserve">, anota cuánto debes y cuándo lo pagas.</w:t>
+      </w:r>
+    </w:p>
+    <w:p>
+      <w:r>
+        <w:rPr>
+          <w:b/>
+          <w:bCs/>
+        </w:rPr>
+        <w:t xml:space="preserve">Señales de que un depósito no es ingreso:</w:t>
+      </w:r>
+    </w:p>
+    <w:p>
+      <w:pPr>
+        <w:pStyle w:val="ListParagraph"/>
+        <w:numPr>
+          <w:ilvl w:val="0"/>
+          <w:numId w:val="2"/>
+        </w:numPr>
+      </w:pPr>
+      <w:r>
+        <w:t xml:space="preserve">Viene de una app de adelantos o de tu patrón "a cuenta" de tu salario.</w:t>
+      </w:r>
+    </w:p>
+    <w:p>
+      <w:pPr>
+        <w:pStyle w:val="ListParagraph"/>
+        <w:numPr>
+          <w:ilvl w:val="0"/>
+          <w:numId w:val="2"/>
+        </w:numPr>
+      </w:pPr>
+      <w:r>
+        <w:t xml:space="preserve">Alguien te dice que te lo prestó o que te lo "depositó por error".</w:t>
+      </w:r>
+    </w:p>
+    <w:p>
+      <w:pPr>
+        <w:pStyle w:val="ListParagraph"/>
+        <w:numPr>
+          <w:ilvl w:val="0"/>
+          <w:numId w:val="2"/>
+        </w:numPr>
+      </w:pPr>
+      <w:r>
+        <w:t xml:space="preserve">Es una transferencia desde otra cuenta tuya.</w:t>
+      </w:r>
+    </w:p>
+    <w:p>
+      <w:pPr>
+        <w:pStyle w:val="ListParagraph"/>
+        <w:numPr>
+          <w:ilvl w:val="0"/>
+          <w:numId w:val="2"/>
+        </w:numPr>
+      </w:pPr>
+      <w:r>
+        <w:t xml:space="preserve">Tiene la palabra </w:t>
+      </w:r>
+      <w:r>
+        <w:rPr>
+          <w:i/>
+          <w:iCs/>
+        </w:rPr>
+        <w:t xml:space="preserve">refund</w:t>
+      </w:r>
+      <w:r>
+        <w:t xml:space="preserve">, </w:t>
+      </w:r>
+      <w:r>
+        <w:rPr>
+          <w:i/>
+          <w:iCs/>
+        </w:rPr>
+        <w:t xml:space="preserve">reversal</w:t>
+      </w:r>
+      <w:r>
+        <w:t xml:space="preserve"> o </w:t>
+      </w:r>
+      <w:r>
+        <w:rPr>
+          <w:i/>
+          <w:iCs/>
+        </w:rPr>
+        <w:t xml:space="preserve">credit adjustment</w:t>
+      </w:r>
+      <w:r>
+        <w:t xml:space="preserve"> en tu estado de cuenta.</w:t>
+      </w:r>
+    </w:p>
+    <w:p>
+      <w:r>
+        <w:rPr>
+          <w:b/>
+          <w:bCs/>
+        </w:rPr>
         <w:t xml:space="preserve">Para recordar:</w:t>
       </w:r>
     </w:p>
@@ -681,7 +909,7 @@
         <w:pStyle w:val="Heading3"/>
       </w:pPr>
       <w:r>
-        <w:t xml:space="preserve">Versión amplia (8 a 10 minutos)</w:t>
+        <w:t xml:space="preserve">Versión amplia (10 minutos)</w:t>
       </w:r>
     </w:p>
     <w:p>
@@ -702,7 +930,7 @@
         <w:pStyle w:val="ListParagraph"/>
         <w:numPr>
           <w:ilvl w:val="0"/>
-          <w:numId w:val="4"/>
+          <w:numId w:val="5"/>
         </w:numPr>
       </w:pPr>
       <w:r>
@@ -721,7 +949,7 @@
         <w:pStyle w:val="ListParagraph"/>
         <w:numPr>
           <w:ilvl w:val="0"/>
-          <w:numId w:val="4"/>
+          <w:numId w:val="5"/>
         </w:numPr>
       </w:pPr>
       <w:r>
@@ -740,7 +968,7 @@
         <w:pStyle w:val="ListParagraph"/>
         <w:numPr>
           <w:ilvl w:val="0"/>
-          <w:numId w:val="4"/>
+          <w:numId w:val="5"/>
         </w:numPr>
       </w:pPr>
       <w:r>
@@ -948,7 +1176,7 @@
         <w:pStyle w:val="ListParagraph"/>
         <w:numPr>
           <w:ilvl w:val="0"/>
-          <w:numId w:val="5"/>
+          <w:numId w:val="6"/>
         </w:numPr>
       </w:pPr>
       <w:r>
@@ -960,7 +1188,7 @@
         <w:pStyle w:val="ListParagraph"/>
         <w:numPr>
           <w:ilvl w:val="0"/>
-          <w:numId w:val="5"/>
+          <w:numId w:val="6"/>
         </w:numPr>
       </w:pPr>
       <w:r>
@@ -3064,7 +3292,7 @@
         <w:pStyle w:val="ListParagraph"/>
         <w:numPr>
           <w:ilvl w:val="0"/>
-          <w:numId w:val="6"/>
+          <w:numId w:val="7"/>
         </w:numPr>
       </w:pPr>
       <w:r>
@@ -3076,7 +3304,7 @@
         <w:pStyle w:val="ListParagraph"/>
         <w:numPr>
           <w:ilvl w:val="0"/>
-          <w:numId w:val="6"/>
+          <w:numId w:val="7"/>
         </w:numPr>
       </w:pPr>
       <w:r>
@@ -3088,7 +3316,7 @@
         <w:pStyle w:val="ListParagraph"/>
         <w:numPr>
           <w:ilvl w:val="0"/>
-          <w:numId w:val="6"/>
+          <w:numId w:val="7"/>
         </w:numPr>
       </w:pPr>
       <w:r>
@@ -3350,7 +3578,7 @@
         <w:t xml:space="preserve">Tiempo de lectura:</w:t>
       </w:r>
       <w:r>
-        <w:t xml:space="preserve"> versión corta 2 a 3 minutos · versión amplia 8 a 10 minutos.</w:t>
+        <w:t xml:space="preserve"> versión corta 5 minutos · versión amplia 10 minutos.</w:t>
       </w:r>
     </w:p>
     <w:p>
@@ -3358,7 +3586,7 @@
         <w:pStyle w:val="Heading3"/>
       </w:pPr>
       <w:r>
-        <w:t xml:space="preserve">Versión corta (2 a 3 minutos)</w:t>
+        <w:t xml:space="preserve">Versión corta (5 minutos)</w:t>
       </w:r>
     </w:p>
     <w:p>
@@ -3390,7 +3618,7 @@
         <w:pStyle w:val="ListParagraph"/>
         <w:numPr>
           <w:ilvl w:val="0"/>
-          <w:numId w:val="7"/>
+          <w:numId w:val="8"/>
         </w:numPr>
       </w:pPr>
       <w:r>
@@ -3409,7 +3637,7 @@
         <w:pStyle w:val="ListParagraph"/>
         <w:numPr>
           <w:ilvl w:val="0"/>
-          <w:numId w:val="7"/>
+          <w:numId w:val="8"/>
         </w:numPr>
       </w:pPr>
       <w:r>
@@ -3428,7 +3656,7 @@
         <w:pStyle w:val="ListParagraph"/>
         <w:numPr>
           <w:ilvl w:val="0"/>
-          <w:numId w:val="7"/>
+          <w:numId w:val="8"/>
         </w:numPr>
       </w:pPr>
       <w:r>
@@ -3468,6 +3696,314 @@
           <w:b/>
           <w:bCs/>
         </w:rPr>
+        <w:t xml:space="preserve">Tres formas de ayudar que pueden dejarte una deuda:</w:t>
+      </w:r>
+    </w:p>
+    <w:tbl>
+      <w:tblPr>
+        <w:tblW w:type="dxa" w:w="9640"/>
+        <w:tblBorders>
+          <w:top w:val="single" w:color="B7C9C0" w:sz="4"/>
+          <w:left w:val="single" w:color="B7C9C0" w:sz="4"/>
+          <w:bottom w:val="single" w:color="B7C9C0" w:sz="4"/>
+          <w:right w:val="single" w:color="B7C9C0" w:sz="4"/>
+          <w:insideH w:val="single" w:color="B7C9C0" w:sz="4"/>
+          <w:insideV w:val="single" w:color="B7C9C0" w:sz="4"/>
+        </w:tblBorders>
+      </w:tblPr>
+      <w:tblGrid>
+        <w:gridCol w:w="4820"/>
+        <w:gridCol w:w="4820"/>
+      </w:tblGrid>
+      <w:tr>
+        <w:trPr>
+          <w:tblHeader/>
+        </w:trPr>
+        <w:tc>
+          <w:tcPr>
+            <w:tcW w:type="dxa" w:w="4820"/>
+            <w:shd w:fill="1F5C4A" w:color="auto" w:val="clear"/>
+            <w:tcMar>
+              <w:top w:type="dxa" w:w="60"/>
+              <w:left w:type="dxa" w:w="90"/>
+              <w:bottom w:type="dxa" w:w="60"/>
+              <w:right w:type="dxa" w:w="90"/>
+            </w:tcMar>
+          </w:tcPr>
+          <w:p>
+            <w:r>
+              <w:rPr>
+                <w:b/>
+                <w:bCs/>
+                <w:color w:val="FFFFFF"/>
+                <w:sz w:val="18"/>
+                <w:szCs w:val="18"/>
+              </w:rPr>
+              <w:t xml:space="preserve">Forma de ayudar</w:t>
+            </w:r>
+          </w:p>
+        </w:tc>
+        <w:tc>
+          <w:tcPr>
+            <w:tcW w:type="dxa" w:w="4820"/>
+            <w:shd w:fill="1F5C4A" w:color="auto" w:val="clear"/>
+            <w:tcMar>
+              <w:top w:type="dxa" w:w="60"/>
+              <w:left w:type="dxa" w:w="90"/>
+              <w:bottom w:type="dxa" w:w="60"/>
+              <w:right w:type="dxa" w:w="90"/>
+            </w:tcMar>
+          </w:tcPr>
+          <w:p>
+            <w:r>
+              <w:rPr>
+                <w:b/>
+                <w:bCs/>
+                <w:color w:val="FFFFFF"/>
+                <w:sz w:val="18"/>
+                <w:szCs w:val="18"/>
+              </w:rPr>
+              <w:t xml:space="preserve">Qué puede pasarte</w:t>
+            </w:r>
+          </w:p>
+        </w:tc>
+      </w:tr>
+      <w:tr>
+        <w:trPr>
+          <w:tblHeader w:val="off"/>
+        </w:trPr>
+        <w:tc>
+          <w:tcPr>
+            <w:tcW w:type="dxa" w:w="4820"/>
+            <w:tcMar>
+              <w:top w:type="dxa" w:w="60"/>
+              <w:left w:type="dxa" w:w="90"/>
+              <w:bottom w:type="dxa" w:w="60"/>
+              <w:right w:type="dxa" w:w="90"/>
+            </w:tcMar>
+          </w:tcPr>
+          <w:p>
+            <w:r>
+              <w:rPr>
+                <w:sz w:val="18"/>
+                <w:szCs w:val="18"/>
+              </w:rPr>
+              <w:t xml:space="preserve">Cofirmar un préstamo</w:t>
+            </w:r>
+          </w:p>
+        </w:tc>
+        <w:tc>
+          <w:tcPr>
+            <w:tcW w:type="dxa" w:w="4820"/>
+            <w:tcMar>
+              <w:top w:type="dxa" w:w="60"/>
+              <w:left w:type="dxa" w:w="90"/>
+              <w:bottom w:type="dxa" w:w="60"/>
+              <w:right w:type="dxa" w:w="90"/>
+            </w:tcMar>
+          </w:tcPr>
+          <w:p>
+            <w:r>
+              <w:rPr>
+                <w:sz w:val="18"/>
+                <w:szCs w:val="18"/>
+              </w:rPr>
+              <w:t xml:space="preserve">Pagar todo el saldo si la otra persona no paga, y que los atrasos aparezcan en tu crédito</w:t>
+            </w:r>
+          </w:p>
+        </w:tc>
+      </w:tr>
+      <w:tr>
+        <w:trPr>
+          <w:tblHeader w:val="off"/>
+        </w:trPr>
+        <w:tc>
+          <w:tcPr>
+            <w:tcW w:type="dxa" w:w="4820"/>
+            <w:tcMar>
+              <w:top w:type="dxa" w:w="60"/>
+              <w:left w:type="dxa" w:w="90"/>
+              <w:bottom w:type="dxa" w:w="60"/>
+              <w:right w:type="dxa" w:w="90"/>
+            </w:tcMar>
+          </w:tcPr>
+          <w:p>
+            <w:r>
+              <w:rPr>
+                <w:sz w:val="18"/>
+                <w:szCs w:val="18"/>
+              </w:rPr>
+              <w:t xml:space="preserve">Prestar tu tarjeta de crédito</w:t>
+            </w:r>
+          </w:p>
+        </w:tc>
+        <w:tc>
+          <w:tcPr>
+            <w:tcW w:type="dxa" w:w="4820"/>
+            <w:tcMar>
+              <w:top w:type="dxa" w:w="60"/>
+              <w:left w:type="dxa" w:w="90"/>
+              <w:bottom w:type="dxa" w:w="60"/>
+              <w:right w:type="dxa" w:w="90"/>
+            </w:tcMar>
+          </w:tcPr>
+          <w:p>
+            <w:r>
+              <w:rPr>
+                <w:sz w:val="18"/>
+                <w:szCs w:val="18"/>
+              </w:rPr>
+              <w:t xml:space="preserve">Todo lo que se gaste queda a tu nombre</w:t>
+            </w:r>
+          </w:p>
+        </w:tc>
+      </w:tr>
+      <w:tr>
+        <w:trPr>
+          <w:tblHeader w:val="off"/>
+        </w:trPr>
+        <w:tc>
+          <w:tcPr>
+            <w:tcW w:type="dxa" w:w="4820"/>
+            <w:tcMar>
+              <w:top w:type="dxa" w:w="60"/>
+              <w:left w:type="dxa" w:w="90"/>
+              <w:bottom w:type="dxa" w:w="60"/>
+              <w:right w:type="dxa" w:w="90"/>
+            </w:tcMar>
+          </w:tcPr>
+          <w:p>
+            <w:r>
+              <w:rPr>
+                <w:sz w:val="18"/>
+                <w:szCs w:val="18"/>
+              </w:rPr>
+              <w:t xml:space="preserve">Compartir tu contraseña</w:t>
+            </w:r>
+          </w:p>
+        </w:tc>
+        <w:tc>
+          <w:tcPr>
+            <w:tcW w:type="dxa" w:w="4820"/>
+            <w:tcMar>
+              <w:top w:type="dxa" w:w="60"/>
+              <w:left w:type="dxa" w:w="90"/>
+              <w:bottom w:type="dxa" w:w="60"/>
+              <w:right w:type="dxa" w:w="90"/>
+            </w:tcMar>
+          </w:tcPr>
+          <w:p>
+            <w:r>
+              <w:rPr>
+                <w:sz w:val="18"/>
+                <w:szCs w:val="18"/>
+              </w:rPr>
+              <w:t xml:space="preserve">Pueden mover tu dinero o pedir préstamos, y el banco podría no reembolsarte</w:t>
+            </w:r>
+          </w:p>
+        </w:tc>
+      </w:tr>
+    </w:tbl>
+    <w:p/>
+    <w:p>
+      <w:r>
+        <w:rPr>
+          <w:b/>
+          <w:bCs/>
+        </w:rPr>
+        <w:t xml:space="preserve">Un ejemplo con números.</w:t>
+      </w:r>
+      <w:r>
+        <w:t xml:space="preserve"> Ganas 2,400 al mes y te quedan 150 libres después de tus gastos. Tu primo te pide cofirmar un auto con pago de 180 al mes. Si él deja de pagar, a ti te faltan 30 cada mes, sin contar los cargos por atraso. En este caso, firmar pone en riesgo tu renta.</w:t>
+      </w:r>
+    </w:p>
+    <w:p>
+      <w:r>
+        <w:rPr>
+          <w:b/>
+          <w:bCs/>
+        </w:rPr>
+        <w:t xml:space="preserve">Otra forma de ayudar.</w:t>
+      </w:r>
+      <w:r>
+        <w:t xml:space="preserve"> Si quieres apoyar, ofrece una cantidad que puedas dar sin que te la devuelvan, o ayuda con información: acompañar a comparar opciones o buscar una cooperativa.</w:t>
+      </w:r>
+    </w:p>
+    <w:p>
+      <w:r>
+        <w:rPr>
+          <w:b/>
+          <w:bCs/>
+        </w:rPr>
+        <w:t xml:space="preserve">Cinco preguntas antes de firmar:</w:t>
+      </w:r>
+    </w:p>
+    <w:p>
+      <w:pPr>
+        <w:pStyle w:val="ListParagraph"/>
+        <w:numPr>
+          <w:ilvl w:val="0"/>
+          <w:numId w:val="9"/>
+        </w:numPr>
+      </w:pPr>
+      <w:r>
+        <w:t xml:space="preserve">¿Cuánto es el pago mensual y por cuántos meses?</w:t>
+      </w:r>
+    </w:p>
+    <w:p>
+      <w:pPr>
+        <w:pStyle w:val="ListParagraph"/>
+        <w:numPr>
+          <w:ilvl w:val="0"/>
+          <w:numId w:val="9"/>
+        </w:numPr>
+      </w:pPr>
+      <w:r>
+        <w:t xml:space="preserve">Si la otra persona deja de pagar, ¿puedo pagarlo yo completo?</w:t>
+      </w:r>
+    </w:p>
+    <w:p>
+      <w:pPr>
+        <w:pStyle w:val="ListParagraph"/>
+        <w:numPr>
+          <w:ilvl w:val="0"/>
+          <w:numId w:val="9"/>
+        </w:numPr>
+      </w:pPr>
+      <w:r>
+        <w:t xml:space="preserve">¿Me darán el aviso para cofirmantes y una copia del contrato?</w:t>
+      </w:r>
+    </w:p>
+    <w:p>
+      <w:pPr>
+        <w:pStyle w:val="ListParagraph"/>
+        <w:numPr>
+          <w:ilvl w:val="0"/>
+          <w:numId w:val="9"/>
+        </w:numPr>
+      </w:pPr>
+      <w:r>
+        <w:t xml:space="preserve">¿Cómo me enteraré si hay un atraso?</w:t>
+      </w:r>
+    </w:p>
+    <w:p>
+      <w:pPr>
+        <w:pStyle w:val="ListParagraph"/>
+        <w:numPr>
+          <w:ilvl w:val="0"/>
+          <w:numId w:val="9"/>
+        </w:numPr>
+      </w:pPr>
+      <w:r>
+        <w:t xml:space="preserve">¿Hay otra forma de ayudar que no me deje una deuda?</w:t>
+      </w:r>
+    </w:p>
+    <w:p>
+      <w:r>
+        <w:rPr>
+          <w:b/>
+          <w:bCs/>
+        </w:rPr>
         <w:t xml:space="preserve">Para recordar:</w:t>
       </w:r>
     </w:p>
@@ -3512,7 +4048,7 @@
         <w:pStyle w:val="Heading3"/>
       </w:pPr>
       <w:r>
-        <w:t xml:space="preserve">Versión amplia (8 a 10 minutos)</w:t>
+        <w:t xml:space="preserve">Versión amplia (10 minutos)</w:t>
       </w:r>
     </w:p>
     <w:p>
@@ -4114,7 +4650,7 @@
         <w:pStyle w:val="ListParagraph"/>
         <w:numPr>
           <w:ilvl w:val="0"/>
-          <w:numId w:val="8"/>
+          <w:numId w:val="10"/>
         </w:numPr>
       </w:pPr>
       <w:r>
@@ -4133,7 +4669,7 @@
         <w:pStyle w:val="ListParagraph"/>
         <w:numPr>
           <w:ilvl w:val="0"/>
-          <w:numId w:val="8"/>
+          <w:numId w:val="10"/>
         </w:numPr>
       </w:pPr>
       <w:r>
@@ -4152,7 +4688,7 @@
         <w:pStyle w:val="ListParagraph"/>
         <w:numPr>
           <w:ilvl w:val="0"/>
-          <w:numId w:val="8"/>
+          <w:numId w:val="10"/>
         </w:numPr>
       </w:pPr>
       <w:r>
@@ -4171,7 +4707,7 @@
         <w:pStyle w:val="ListParagraph"/>
         <w:numPr>
           <w:ilvl w:val="0"/>
-          <w:numId w:val="8"/>
+          <w:numId w:val="10"/>
         </w:numPr>
       </w:pPr>
       <w:r>
@@ -4898,7 +5434,7 @@
         <w:pStyle w:val="ListParagraph"/>
         <w:numPr>
           <w:ilvl w:val="0"/>
-          <w:numId w:val="9"/>
+          <w:numId w:val="11"/>
         </w:numPr>
       </w:pPr>
       <w:r>
@@ -4910,7 +5446,7 @@
         <w:pStyle w:val="ListParagraph"/>
         <w:numPr>
           <w:ilvl w:val="0"/>
-          <w:numId w:val="9"/>
+          <w:numId w:val="11"/>
         </w:numPr>
       </w:pPr>
       <w:r>
@@ -4922,7 +5458,7 @@
         <w:pStyle w:val="ListParagraph"/>
         <w:numPr>
           <w:ilvl w:val="0"/>
-          <w:numId w:val="9"/>
+          <w:numId w:val="11"/>
         </w:numPr>
       </w:pPr>
       <w:r>
@@ -5340,6 +5876,18 @@
     </w:lvlOverride>
   </w:num>
   <w:num w:numId="9">
+    <w:abstractNumId w:val="3"/>
+    <w:lvlOverride w:ilvl="0">
+      <w:startOverride w:val="1"/>
+    </w:lvlOverride>
+  </w:num>
+  <w:num w:numId="10">
+    <w:abstractNumId w:val="3"/>
+    <w:lvlOverride w:ilvl="0">
+      <w:startOverride w:val="1"/>
+    </w:lvlOverride>
+  </w:num>
+  <w:num w:numId="11">
     <w:abstractNumId w:val="3"/>
     <w:lvlOverride w:ilvl="0">
       <w:startOverride w:val="1"/>

</xml_diff>

<commit_message>
Muestra v4: términos con significado, vínculos, datos adicionales, colores de marca y glosario de Moodle
Co-Authored-By: Claude Opus 5.5 <noreply@anthropic.com>
Claude-Session: https://claude.ai/code/session_01P5F6YBSbmgYFHyY7RUeBgK
</commit_message>
<xml_diff>
--- a/proyecto-inclusion-financiera/manual/muestras/Muestra_version_corta_y_amplia.docx
+++ b/proyecto-inclusion-financiera/manual/muestras/Muestra_version_corta_y_amplia.docx
@@ -129,6 +129,40 @@
       </w:pPr>
       <w:r>
         <w:t xml:space="preserve">Al inicio de cada lección se indica el tiempo de lectura de cada versión.</w:t>
+      </w:r>
+    </w:p>
+    <w:p>
+      <w:pPr>
+        <w:pStyle w:val="ListParagraph"/>
+        <w:numPr>
+          <w:ilvl w:val="0"/>
+          <w:numId w:val="2"/>
+        </w:numPr>
+      </w:pPr>
+      <w:r>
+        <w:t xml:space="preserve">Los términos importantes aparecen en color. Al pasar el cursor encima (o tocarlos en el celular, si el tema lo permite) aparece su significado en palabras sencillas.</w:t>
+      </w:r>
+    </w:p>
+    <w:p>
+      <w:pPr>
+        <w:pStyle w:val="ListParagraph"/>
+        <w:numPr>
+          <w:ilvl w:val="0"/>
+          <w:numId w:val="2"/>
+        </w:numPr>
+      </w:pPr>
+      <w:r>
+        <w:t xml:space="preserve">Hay vínculos a fuentes oficiales dentro del texto y recuadros de </w:t>
+      </w:r>
+      <w:r>
+        <w:rPr>
+          <w:b/>
+          <w:bCs/>
+        </w:rPr>
+        <w:t xml:space="preserve">Dato adicional</w:t>
+      </w:r>
+      <w:r>
+        <w:t xml:space="preserve">.</w:t>
       </w:r>
     </w:p>
     <w:p>
@@ -300,12 +334,26 @@
           <w:p>
             <w:r>
               <w:rPr>
+                <w:sz w:val="18"/>
+                <w:szCs w:val="18"/>
+              </w:rPr>
+              <w:t xml:space="preserve">**</w:t>
+            </w:r>
+            <w:r>
+              <w:rPr>
                 <w:b/>
                 <w:bCs/>
                 <w:sz w:val="18"/>
                 <w:szCs w:val="18"/>
               </w:rPr>
               <w:t xml:space="preserve">Ingreso ganado</w:t>
+            </w:r>
+            <w:r>
+              <w:rPr>
+                <w:sz w:val="18"/>
+                <w:szCs w:val="18"/>
+              </w:rPr>
+              <w:t xml:space="preserve">**</w:t>
             </w:r>
           </w:p>
         </w:tc>
@@ -367,12 +415,26 @@
           <w:p>
             <w:r>
               <w:rPr>
+                <w:sz w:val="18"/>
+                <w:szCs w:val="18"/>
+              </w:rPr>
+              <w:t xml:space="preserve">**</w:t>
+            </w:r>
+            <w:r>
+              <w:rPr>
                 <w:b/>
                 <w:bCs/>
                 <w:sz w:val="18"/>
                 <w:szCs w:val="18"/>
               </w:rPr>
               <w:t xml:space="preserve">Préstamo</w:t>
+            </w:r>
+            <w:r>
+              <w:rPr>
+                <w:sz w:val="18"/>
+                <w:szCs w:val="18"/>
+              </w:rPr>
+              <w:t xml:space="preserve">**</w:t>
             </w:r>
           </w:p>
         </w:tc>
@@ -501,12 +563,26 @@
           <w:p>
             <w:r>
               <w:rPr>
+                <w:sz w:val="18"/>
+                <w:szCs w:val="18"/>
+              </w:rPr>
+              <w:t xml:space="preserve">**</w:t>
+            </w:r>
+            <w:r>
+              <w:rPr>
                 <w:b/>
                 <w:bCs/>
                 <w:sz w:val="18"/>
                 <w:szCs w:val="18"/>
               </w:rPr>
               <w:t xml:space="preserve">Devolución</w:t>
+            </w:r>
+            <w:r>
+              <w:rPr>
+                <w:sz w:val="18"/>
+                <w:szCs w:val="18"/>
+              </w:rPr>
+              <w:t xml:space="preserve">**</w:t>
             </w:r>
           </w:p>
         </w:tc>
@@ -618,7 +694,7 @@
         <w:t xml:space="preserve">Idea clave:</w:t>
       </w:r>
       <w:r>
-        <w:t xml:space="preserve"> un préstamo te da dinero para usar hoy, pero no te hace más rico. Lo que tienes menos lo que debes se llama </w:t>
+        <w:t xml:space="preserve"> un préstamo te da dinero para usar hoy, pero no te hace más rico. Lo que tienes menos lo que debes se llama **</w:t>
       </w:r>
       <w:r>
         <w:rPr>
@@ -628,7 +704,7 @@
         <w:t xml:space="preserve">patrimonio neto</w:t>
       </w:r>
       <w:r>
-        <w:t xml:space="preserve">.</w:t>
+        <w:t xml:space="preserve">**.</w:t>
       </w:r>
     </w:p>
     <w:p>
@@ -790,7 +866,17 @@
         </w:numPr>
       </w:pPr>
       <w:r>
-        <w:t xml:space="preserve">Viene de una app de adelantos o de tu patrón "a cuenta" de tu salario.</w:t>
+        <w:t xml:space="preserve">Viene de una app de </w:t>
+      </w:r>
+      <w:r>
+        <w:rPr>
+          <w:b/>
+          <w:bCs/>
+        </w:rPr>
+        <w:t xml:space="preserve">adelantos de nómina</w:t>
+      </w:r>
+      <w:r>
+        <w:t xml:space="preserve"> o de tu patrón "a cuenta" de tu salario.</w:t>
       </w:r>
     </w:p>
     <w:p>
@@ -1069,7 +1155,7 @@
         </w:numPr>
       </w:pPr>
       <w:r>
-        <w:t xml:space="preserve">Un billete es </w:t>
+        <w:t xml:space="preserve">Un billete es **</w:t>
       </w:r>
       <w:r>
         <w:rPr>
@@ -1079,7 +1165,7 @@
         <w:t xml:space="preserve">efectivo</w:t>
       </w:r>
       <w:r>
-        <w:t xml:space="preserve">.</w:t>
+        <w:t xml:space="preserve">**.</w:t>
       </w:r>
     </w:p>
     <w:p>
@@ -1091,7 +1177,7 @@
         </w:numPr>
       </w:pPr>
       <w:r>
-        <w:t xml:space="preserve">Un saldo en el banco es un </w:t>
+        <w:t xml:space="preserve">Un saldo en el banco es un **</w:t>
       </w:r>
       <w:r>
         <w:rPr>
@@ -1101,7 +1187,7 @@
         <w:t xml:space="preserve">depósito</w:t>
       </w:r>
       <w:r>
-        <w:t xml:space="preserve">: la institución te debe ese dinero.</w:t>
+        <w:t xml:space="preserve">**: la institución te debe ese dinero.</w:t>
       </w:r>
     </w:p>
     <w:p>
@@ -1113,7 +1199,7 @@
         </w:numPr>
       </w:pPr>
       <w:r>
-        <w:t xml:space="preserve">Una tarjeta de </w:t>
+        <w:t xml:space="preserve">Una tarjeta de **</w:t>
       </w:r>
       <w:r>
         <w:rPr>
@@ -1123,6 +1209,10 @@
         <w:t xml:space="preserve">débito</w:t>
       </w:r>
       <w:r>
+        <w:rPr>
+          <w:b/>
+          <w:bCs/>
+        </w:rPr>
         <w:t xml:space="preserve"> usa tu depósito. Una tarjeta de </w:t>
       </w:r>
       <w:r>
@@ -1133,7 +1223,7 @@
         <w:t xml:space="preserve">crédito</w:t>
       </w:r>
       <w:r>
-        <w:t xml:space="preserve"> usa un préstamo.</w:t>
+        <w:t xml:space="preserve">** usa un préstamo.</w:t>
       </w:r>
     </w:p>
     <w:p>
@@ -1155,7 +1245,27 @@
         <w:t xml:space="preserve">aplicación</w:t>
       </w:r>
       <w:r>
-        <w:t xml:space="preserve"> puede mostrarte varios saldos en la misma pantalla. Antes de usarla, averigua quién guarda tu dinero y qué lo protege (lo verás en el Módulo 2).</w:t>
+        <w:t xml:space="preserve"> puede mostrarte varios saldos en la misma pantalla. Antes de usarla, averigua quién guarda tu dinero y qué lo protege (lo verás en el Módulo 2). Puedes revisar si un banco está asegurado en [FDIC BankFind](https://banks.data.fdic.gov/bankfind-suite/) y si una cooperativa lo está en [NCUA](https://mapping.ncua.gov).</w:t>
+      </w:r>
+    </w:p>
+    <w:p>
+      <w:pPr>
+        <w:pBdr>
+          <w:left w:val="single" w:color="1F5C4A" w:sz="18" w:space="8"/>
+        </w:pBdr>
+        <w:shd w:fill="EAF2EE" w:color="auto" w:val="clear"/>
+        <w:spacing w:after="160" w:before="120"/>
+        <w:ind w:left="200" w:right="200"/>
+      </w:pPr>
+      <w:r>
+        <w:rPr>
+          <w:b/>
+          <w:bCs/>
+        </w:rPr>
+        <w:t xml:space="preserve">Dato adicional:</w:t>
+      </w:r>
+      <w:r>
+        <w:t xml:space="preserve"> en EE. UU., el dinero en un banco asegurado por la FDIC está protegido hasta 250,000 dólares por persona, por banco y por tipo de cuenta. En las cooperativas aseguradas, la NCUA da una protección equivalente.</w:t>
       </w:r>
     </w:p>
     <w:p>
@@ -1439,7 +1549,23 @@
                 <w:sz w:val="18"/>
                 <w:szCs w:val="18"/>
               </w:rPr>
-              <w:t xml:space="preserve">Pagas parte de una deuda (capital)</w:t>
+              <w:t xml:space="preserve">Pagas parte de una deuda (</w:t>
+            </w:r>
+            <w:r>
+              <w:rPr>
+                <w:b/>
+                <w:bCs/>
+                <w:sz w:val="18"/>
+                <w:szCs w:val="18"/>
+              </w:rPr>
+              <w:t xml:space="preserve">capital</w:t>
+            </w:r>
+            <w:r>
+              <w:rPr>
+                <w:sz w:val="18"/>
+                <w:szCs w:val="18"/>
+              </w:rPr>
+              <w:t xml:space="preserve">)</w:t>
             </w:r>
           </w:p>
         </w:tc>
@@ -1504,7 +1630,16 @@
                 <w:sz w:val="18"/>
                 <w:szCs w:val="18"/>
               </w:rPr>
-              <w:t xml:space="preserve">Pagas intereses</w:t>
+              <w:t xml:space="preserve">Pagas </w:t>
+            </w:r>
+            <w:r>
+              <w:rPr>
+                <w:b/>
+                <w:bCs/>
+                <w:sz w:val="18"/>
+                <w:szCs w:val="18"/>
+              </w:rPr>
+              <w:t xml:space="preserve">intereses</w:t>
             </w:r>
           </w:p>
         </w:tc>
@@ -2852,7 +2987,7 @@
         <w:t xml:space="preserve">¿Por qué?</w:t>
       </w:r>
       <w:r>
-        <w:t xml:space="preserve"> Puede ser un error del banco o una estafa. En muchas estafas el depósito original se cancela después, y el dinero que Alex "devuelva" saldría de su propio saldo.</w:t>
+        <w:t xml:space="preserve"> Puede ser un error del banco o una estafa. En muchas estafas el depósito original se cancela después, y el dinero que Alex "devuelva" saldría de su propio saldo. La FTC explica esta estafa en [Estafas de cheques falsos](https://consumidor.ftc.gov/articulos/estafas-de-cheques-falsos) y puedes reportarla en [ReporteFraude.ftc.gov](https://reportefraude.ftc.gov).</w:t>
       </w:r>
     </w:p>
     <w:p>
@@ -3591,7 +3726,7 @@
     </w:p>
     <w:p>
       <w:r>
-        <w:t xml:space="preserve">Cuando firmas como </w:t>
+        <w:t xml:space="preserve">Cuando firmas como **</w:t>
       </w:r>
       <w:r>
         <w:rPr>
@@ -3601,7 +3736,14 @@
         <w:t xml:space="preserve">cofirmante o aval</w:t>
       </w:r>
       <w:r>
-        <w:t xml:space="preserve"> de un préstamo, te comprometes a pagar si la otra persona no paga. Para el prestamista, esa deuda también es tuya.</w:t>
+        <w:rPr>
+          <w:b/>
+          <w:bCs/>
+        </w:rPr>
+        <w:t xml:space="preserve"> de un préstamo, te comprometes a pagar si la otra persona no paga. Para el </w:t>
+      </w:r>
+      <w:r>
+        <w:t xml:space="preserve">prestamista**, esa deuda también es tuya.</w:t>
       </w:r>
     </w:p>
     <w:p>
@@ -3629,7 +3771,17 @@
         <w:t xml:space="preserve">Lee qué responsabilidad asumes.</w:t>
       </w:r>
       <w:r>
-        <w:t xml:space="preserve"> Pide el contrato y el aviso para cofirmantes.</w:t>
+        <w:t xml:space="preserve"> Pide el contrato y el </w:t>
+      </w:r>
+      <w:r>
+        <w:rPr>
+          <w:b/>
+          <w:bCs/>
+        </w:rPr>
+        <w:t xml:space="preserve">aviso para cofirmantes</w:t>
+      </w:r>
+      <w:r>
+        <w:t xml:space="preserve">.</w:t>
       </w:r>
     </w:p>
     <w:p>
@@ -3808,7 +3960,16 @@
                 <w:sz w:val="18"/>
                 <w:szCs w:val="18"/>
               </w:rPr>
-              <w:t xml:space="preserve">Pagar todo el saldo si la otra persona no paga, y que los atrasos aparezcan en tu crédito</w:t>
+              <w:t xml:space="preserve">Pagar todo el saldo si la otra persona no paga, y que los atrasos aparezcan en tu </w:t>
+            </w:r>
+            <w:r>
+              <w:rPr>
+                <w:b/>
+                <w:bCs/>
+                <w:sz w:val="18"/>
+                <w:szCs w:val="18"/>
+              </w:rPr>
+              <w:t xml:space="preserve">reporte de crédito</w:t>
             </w:r>
           </w:p>
         </w:tc>
@@ -4137,7 +4298,17 @@
         <w:t xml:space="preserve">Salir del contrato no es fácil.</w:t>
       </w:r>
       <w:r>
-        <w:t xml:space="preserve"> Normalmente solo termina cuando la deuda se paga o se refinancia sin ti.</w:t>
+        <w:t xml:space="preserve"> Normalmente solo termina cuando la deuda se paga o se </w:t>
+      </w:r>
+      <w:r>
+        <w:rPr>
+          <w:b/>
+          <w:bCs/>
+        </w:rPr>
+        <w:t xml:space="preserve">refinancia</w:t>
+      </w:r>
+      <w:r>
+        <w:t xml:space="preserve"> sin ti.</w:t>
       </w:r>
     </w:p>
     <w:p>
@@ -4152,7 +4323,27 @@
         <w:t xml:space="preserve">aviso para cofirmantes</w:t>
       </w:r>
       <w:r>
-        <w:t xml:space="preserve"> antes de firmar. Pídelo y léelo con calma.</w:t>
+        <w:t xml:space="preserve"> antes de firmar. Pídelo y léelo con calma. La FTC explica tus riesgos en [Cofirmar un préstamo: preguntas frecuentes](https://consumer.ftc.gov/articles/cosigning-loan-faqs) (en inglés).</w:t>
+      </w:r>
+    </w:p>
+    <w:p>
+      <w:pPr>
+        <w:pBdr>
+          <w:left w:val="single" w:color="1F5C4A" w:sz="18" w:space="8"/>
+        </w:pBdr>
+        <w:shd w:fill="EAF2EE" w:color="auto" w:val="clear"/>
+        <w:spacing w:after="160" w:before="120"/>
+        <w:ind w:left="200" w:right="200"/>
+      </w:pPr>
+      <w:r>
+        <w:rPr>
+          <w:b/>
+          <w:bCs/>
+        </w:rPr>
+        <w:t xml:space="preserve">Dato adicional:</w:t>
+      </w:r>
+      <w:r>
+        <w:t xml:space="preserve"> en California, la ley pide que el aviso para cofirmantes se entregue en inglés y en español. Si no te lo dieron, pídelo antes de firmar.</w:t>
       </w:r>
     </w:p>
     <w:p>
@@ -4478,7 +4669,14 @@
                 <w:sz w:val="18"/>
                 <w:szCs w:val="18"/>
               </w:rPr>
-              <w:t xml:space="preserve">Agregar a alguien como usuario autorizado</w:t>
+              <w:t xml:space="preserve">Agregar a alguien como </w:t>
+            </w:r>
+            <w:r>
+              <w:rPr>
+                <w:sz w:val="18"/>
+                <w:szCs w:val="18"/>
+              </w:rPr>
+              <w:t xml:space="preserve">usuario autorizado****</w:t>
             </w:r>
           </w:p>
         </w:tc>
@@ -4802,7 +5000,17 @@
     </w:p>
     <w:p>
       <w:r>
-        <w:t xml:space="preserve">Nunca compartas tu usuario y contraseña, ni con familiares. Quien entra con tus credenciales puede:</w:t>
+        <w:t xml:space="preserve">Nunca compartas tus </w:t>
+      </w:r>
+      <w:r>
+        <w:rPr>
+          <w:b/>
+          <w:bCs/>
+        </w:rPr>
+        <w:t xml:space="preserve">credenciales</w:t>
+      </w:r>
+      <w:r>
+        <w:t xml:space="preserve">, ni con familiares. Quien entra con tus credenciales puede:</w:t>
       </w:r>
     </w:p>
     <w:p>
@@ -4986,7 +5194,7 @@
         <w:t xml:space="preserve">¿Qué puede hacer ahora?</w:t>
       </w:r>
       <w:r>
-        <w:t xml:space="preserve"> Hablar con el prestamista antes de atrasarse (M3 U07) y acordar con su primo un plan por escrito.</w:t>
+        <w:t xml:space="preserve"> Hablar con el prestamista antes de atrasarse (M3 U07). Si tiene dudas sobre sus derechos, puede consultar al [CFPB en español](https://www.consumerfinance.gov/es/) o presentar una queja ahí y acordar con su primo un plan por escrito.</w:t>
       </w:r>
     </w:p>
     <w:p>

</xml_diff>

<commit_message>
Muestra v5: lección interactiva con selector de versión, tarjetas, respuestas plegables y qué buscar en recursos
Co-Authored-By: Claude Opus 5.5 <noreply@anthropic.com>
Claude-Session: https://claude.ai/code/session_01P5F6YBSbmgYFHyY7RUeBgK
</commit_message>
<xml_diff>
--- a/proyecto-inclusion-financiera/manual/muestras/Muestra_version_corta_y_amplia.docx
+++ b/proyecto-inclusion-financiera/manual/muestras/Muestra_version_corta_y_amplia.docx
@@ -163,6 +163,28 @@
       </w:r>
       <w:r>
         <w:t xml:space="preserve">.</w:t>
+      </w:r>
+    </w:p>
+    <w:p>
+      <w:pPr>
+        <w:pStyle w:val="ListParagraph"/>
+        <w:numPr>
+          <w:ilvl w:val="0"/>
+          <w:numId w:val="2"/>
+        </w:numPr>
+      </w:pPr>
+      <w:r>
+        <w:t xml:space="preserve">En "Para saber más" cada recurso dice </w:t>
+      </w:r>
+      <w:r>
+        <w:rPr>
+          <w:b/>
+          <w:bCs/>
+        </w:rPr>
+        <w:t xml:space="preserve">qué buscar</w:t>
+      </w:r>
+      <w:r>
+        <w:t xml:space="preserve"> dentro del enlace.</w:t>
       </w:r>
     </w:p>
     <w:p>
@@ -3552,7 +3574,7 @@
         <w:t xml:space="preserve">Money Smart para adultos</w:t>
       </w:r>
       <w:r>
-        <w:t xml:space="preserve"> (FDIC; idioma: ES/EN): https://www.fdic.gov/consumer-resource-center/money-smart-adults</w:t>
+        <w:t xml:space="preserve"> (FDIC; idioma: ES/EN): https://www.fdic.gov/consumer-resource-center/money-smart-adults — Qué buscar: elige la versión en español y abre el módulo sobre presupuesto y manejo del dinero. Úsalo para practicar cómo separar ingresos, gastos y deudas.</w:t>
       </w:r>
     </w:p>
     <w:p>
@@ -3568,10 +3590,29 @@
           <w:b/>
           <w:bCs/>
         </w:rPr>
-        <w:t xml:space="preserve">CFPB en español</w:t>
-      </w:r>
-      <w:r>
-        <w:t xml:space="preserve"> (CFPB; idioma: ES): https://www.consumerfinance.gov/es/</w:t>
+        <w:t xml:space="preserve">Estafas de cheques falsos</w:t>
+      </w:r>
+      <w:r>
+        <w:t xml:space="preserve"> (FTC; idioma: ES): https://consumidor.ftc.gov/articulos/estafas-de-cheques-falsos — Qué buscar: las señales de un depósito "por error" y qué hacer antes de devolver dinero (Caso 3).</w:t>
+      </w:r>
+    </w:p>
+    <w:p>
+      <w:pPr>
+        <w:pStyle w:val="ListParagraph"/>
+        <w:numPr>
+          <w:ilvl w:val="0"/>
+          <w:numId w:val="2"/>
+        </w:numPr>
+      </w:pPr>
+      <w:r>
+        <w:rPr>
+          <w:b/>
+          <w:bCs/>
+        </w:rPr>
+        <w:t xml:space="preserve">Verificar un banco asegurado</w:t>
+      </w:r>
+      <w:r>
+        <w:t xml:space="preserve"> (FDIC BankFind; idioma: EN): https://banks.data.fdic.gov/bankfind-suite/ — Qué buscar: escribe el nombre de tu banco o del banco aliado de tu app y confirma que aparece como asegurado.</w:t>
       </w:r>
     </w:p>
     <w:p>
@@ -5719,10 +5760,29 @@
           <w:b/>
           <w:bCs/>
         </w:rPr>
+        <w:t xml:space="preserve">Cofirmar un préstamo: preguntas frecuentes</w:t>
+      </w:r>
+      <w:r>
+        <w:t xml:space="preserve"> (FTC; idioma: EN): https://consumer.ftc.gov/articles/cosigning-loan-faqs — Qué buscar: qué pasa si la otra persona no paga y el texto del aviso para cofirmantes que te deben entregar antes de firmar.</w:t>
+      </w:r>
+    </w:p>
+    <w:p>
+      <w:pPr>
+        <w:pStyle w:val="ListParagraph"/>
+        <w:numPr>
+          <w:ilvl w:val="0"/>
+          <w:numId w:val="2"/>
+        </w:numPr>
+      </w:pPr>
+      <w:r>
+        <w:rPr>
+          <w:b/>
+          <w:bCs/>
+        </w:rPr>
         <w:t xml:space="preserve">CFPB en español</w:t>
       </w:r>
       <w:r>
-        <w:t xml:space="preserve"> (CFPB; idioma: ES): https://www.consumerfinance.gov/es/</w:t>
+        <w:t xml:space="preserve"> (CFPB; idioma: ES): https://www.consumerfinance.gov/es/ — Qué buscar: escribe "cofirmante" o "cobranza de deudas" en el buscador para ver tus derechos si te cobran una deuda que firmaste.</w:t>
       </w:r>
     </w:p>
     <w:p>
@@ -5741,7 +5801,7 @@
         <w:t xml:space="preserve">Money Smart para adultos</w:t>
       </w:r>
       <w:r>
-        <w:t xml:space="preserve"> (FDIC; idioma: ES/EN): https://www.fdic.gov/consumer-resource-center/money-smart-adults</w:t>
+        <w:t xml:space="preserve"> (FDIC; idioma: ES/EN): https://www.fdic.gov/consumer-resource-center/money-smart-adults — Qué buscar: el módulo sobre préstamos y crédito, para calcular si una cuota cabe en tu presupuesto.</w:t>
       </w:r>
     </w:p>
     <w:p>

</xml_diff>